<commit_message>
Make the site portfolio-first and sync with the updated CV
- Hero: 'I build AI agents and data systems people rely on', CTAs See my work + Download CV, hiring line with EU passport; booking demoted to a text link
- Nav 'Services' becomes 'Consulting', with a link to corkaiconsulting.ie
- Updated CV (PDF/DOCX): BlarneyKey co-built, Selected Projects with real figures, August assessment framed as pre-launch
- Experience and case-study copy matched to the CV

Co-Authored-By: Claude Opus 5.5 <noreply@anthropic.com>
</commit_message>
<xml_diff>
--- a/public/Murilo-Reis-CV.docx
+++ b/public/Murilo-Reis-CV.docx
@@ -71,7 +71,7 @@
           <w:spacing w:val="0"/>
           <w:color w:val="15171F"/>
         </w:rPr>
-        <w:t xml:space="preserve">Data and AI specialist who turns messy operational data and manual processes into systems people rely on every day. Nearly four years building ETL pipelines, dashboards, predictive models and, more recently, AI agents across Apple, a Brazilian data team and independent clients. At Apple's EMEIA Sales BPR &amp; Systems team I built the automation and reporting behind multi-billion-dollar sales programmes. Today I co-run Cork AI Consulting, helping Irish businesses find where time and money leak, fix the process, then automate it with AI that is safe, measurable and handed over properly.</w:t>
+        <w:t xml:space="preserve">Data and AI specialist who turns messy operational data and manual processes into systems people rely on every day. Nearly four years shipping ETL pipelines, dashboards, predictive models and, more recently, production AI agents across Apple, a Brazilian data team, independent clients and my own products. At Apple's EMEIA Sales BPR &amp; Systems team I built the automation and reporting behind multi-billion-dollar sales programmes. Today I co-run Cork AI Consulting, helping Irish businesses find where time and money leak, fix the process, then automate it with AI that is safe, measurable and handed over properly.</w:t>
       </w:r>
     </w:p>
     <w:p>
@@ -215,7 +215,7 @@
           <w:spacing w:val="0"/>
           <w:color w:val="15171F"/>
         </w:rPr>
-        <w:t xml:space="preserve">Built the delivery engine for the AI Opportunity Assessment: an agent that turns a discovery-call transcript into a client-branded, ROI-backed report, with an honesty check that blocks unsupported claims. First assessment delivered to a client in August 2026.</w:t>
+        <w:t xml:space="preserve">Built the delivery engine for the company's core product, the AI Opportunity Assessment: an agent that turns a discovery-call transcript into a client-branded, ROI-backed report, with an honesty gate that blocks any claim the client didn't support. Delivered to the first client before launch.</w:t>
       </w:r>
     </w:p>
     <w:p>
@@ -302,7 +302,7 @@
           <w:spacing w:val="0"/>
           <w:color w:val="15171F"/>
         </w:rPr>
-        <w:t xml:space="preserve">Designed the company's products showcase, including a live demo of BlarneyKey, a free, private, offline AI dictation app for macOS.</w:t>
+        <w:t xml:space="preserve">Co-built and shipped BlarneyKey, a free, open-source macOS dictation app that runs Whisper on the Apple Neural Engine fully offline, and designed the company's products showcase around its live demo.</w:t>
       </w:r>
     </w:p>
     <w:p>
@@ -343,7 +343,7 @@
           <w:spacing w:val="0"/>
           <w:color w:val="15171F"/>
         </w:rPr>
-        <w:t xml:space="preserve"> Claude Code, Codex CLI, Claude API, Python, SQL, JavaScript/Node, Playwright, Vercel, Notion.</w:t>
+        <w:t xml:space="preserve"> Claude Code, Codex CLI, Claude API, MCP, Python, SQL, JavaScript/Node, Swift, Playwright, Vercel, Notion.</w:t>
       </w:r>
     </w:p>
     <w:p>
@@ -926,6 +926,134 @@
           <w:color w:val="15171F"/>
         </w:rPr>
         <w:t xml:space="preserve">First point of contact for IT in a busy legal office: hardware and software support, system maintenance and network configuration.</w:t>
+      </w:r>
+    </w:p>
+    <w:p>
+      <w:pPr>
+        <w:spacing w:after="120"/>
+      </w:pPr>
+      <w:r>
+        <w:rPr>
+          <w:rFonts w:ascii="Helvetica Neue" w:hAnsi="Helvetica Neue" w:cs="Helvetica Neue"/>
+          <w:sz w:val="25"/>
+          <w:sz-cs w:val="25"/>
+          <w:b/>
+          <w:spacing w:val="0"/>
+          <w:color w:val="0B4EE1"/>
+        </w:rPr>
+        <w:t xml:space="preserve">SELECTED PROJECTS</w:t>
+      </w:r>
+    </w:p>
+    <w:p>
+      <w:pPr/>
+      <w:r>
+        <w:rPr>
+          <w:rFonts w:ascii="Helvetica Neue" w:hAnsi="Helvetica Neue" w:cs="Helvetica Neue"/>
+          <w:sz w:val="25"/>
+          <w:sz-cs w:val="25"/>
+          <w:b/>
+          <w:spacing w:val="0"/>
+          <w:color w:val="0B0F18"/>
+        </w:rPr>
+        <w:t xml:space="preserve">Vinted Tracker · reselling analytics &amp; AI sales agent</w:t>
+      </w:r>
+    </w:p>
+    <w:p>
+      <w:pPr/>
+      <w:r>
+        <w:rPr>
+          <w:rFonts w:ascii="Helvetica Neue" w:hAnsi="Helvetica Neue" w:cs="Helvetica Neue"/>
+          <w:sz w:val="25"/>
+          <w:sz-cs w:val="25"/>
+          <w:spacing w:val="0"/>
+          <w:color w:val="373E53"/>
+        </w:rPr>
+        <w:t xml:space="preserve">2026</w:t>
+      </w:r>
+    </w:p>
+    <w:p>
+      <w:pPr>
+        <w:ind w:left="720" w:first-line="-720"/>
+        <w:spacing w:after="30"/>
+      </w:pPr>
+      <w:r>
+        <w:rPr>
+          <w:rFonts w:ascii="Helvetica Neue" w:hAnsi="Helvetica Neue" w:cs="Helvetica Neue"/>
+          <w:sz w:val="25"/>
+          <w:sz-cs w:val="25"/>
+          <w:color w:val="15171F"/>
+        </w:rPr>
+        <w:t xml:space="preserve"/>
+        <w:tab/>
+        <w:t xml:space="preserve">•</w:t>
+        <w:tab/>
+        <w:t xml:space="preserve"/>
+      </w:r>
+      <w:r>
+        <w:rPr>
+          <w:rFonts w:ascii="Helvetica Neue" w:hAnsi="Helvetica Neue" w:cs="Helvetica Neue"/>
+          <w:sz w:val="25"/>
+          <w:sz-cs w:val="25"/>
+          <w:spacing w:val="0"/>
+          <w:color w:val="15171F"/>
+        </w:rPr>
+        <w:t xml:space="preserve">Built a local-first Streamlit + SQLite app running my own resale business: 194 orders across 183 items tracked to true profit after fees, plus an LLM agent that drafts listings from photos. Guarded by 780+ automated tests.</w:t>
+      </w:r>
+    </w:p>
+    <w:p>
+      <w:pPr/>
+      <w:r>
+        <w:rPr>
+          <w:rFonts w:ascii="Helvetica Neue" w:hAnsi="Helvetica Neue" w:cs="Helvetica Neue"/>
+          <w:sz w:val="25"/>
+          <w:sz-cs w:val="25"/>
+          <w:b/>
+          <w:spacing w:val="0"/>
+          <w:color w:val="0B0F18"/>
+        </w:rPr>
+        <w:t xml:space="preserve">Job-search pipeline · Python, SQLite, official job-board APIs</w:t>
+      </w:r>
+    </w:p>
+    <w:p>
+      <w:pPr/>
+      <w:r>
+        <w:rPr>
+          <w:rFonts w:ascii="Helvetica Neue" w:hAnsi="Helvetica Neue" w:cs="Helvetica Neue"/>
+          <w:sz w:val="25"/>
+          <w:sz-cs w:val="25"/>
+          <w:spacing w:val="0"/>
+          <w:color w:val="373E53"/>
+        </w:rPr>
+        <w:t xml:space="preserve">2026</w:t>
+      </w:r>
+    </w:p>
+    <w:p>
+      <w:pPr>
+        <w:ind w:left="720" w:first-line="-720"/>
+        <w:spacing w:after="30"/>
+      </w:pPr>
+      <w:r>
+        <w:rPr>
+          <w:rFonts w:ascii="Helvetica Neue" w:hAnsi="Helvetica Neue" w:cs="Helvetica Neue"/>
+          <w:sz w:val="25"/>
+          <w:sz-cs w:val="25"/>
+          <w:color w:val="15171F"/>
+        </w:rPr>
+        <w:t xml:space="preserve"/>
+        <w:tab/>
+        <w:t xml:space="preserve">•</w:t>
+        <w:tab/>
+        <w:t xml:space="preserve"/>
+      </w:r>
+      <w:r>
+        <w:rPr>
+          <w:rFonts w:ascii="Helvetica Neue" w:hAnsi="Helvetica Neue" w:cs="Helvetica Neue"/>
+          <w:sz w:val="25"/>
+          <w:sz-cs w:val="25"/>
+          <w:spacing w:val="0"/>
+          <w:color w:val="15171F"/>
+        </w:rPr>
+        <w:t xml:space="preserve">Collected 1,350 roles from 71 companies via Greenhouse, Lever, Ashby and Workday feeds, auto-scored 1,245 (154 hot), and generated tailored CVs checked line by line against a single source profile so nothing is invented.</w:t>
       </w:r>
     </w:p>
     <w:p>

</xml_diff>